<commit_message>
Update Actividad Notebook 03– Introducción a Python.docx
</commit_message>
<xml_diff>
--- a/NOTEBOOK/Actividad Notebook 03– Introducción a Python.docx
+++ b/NOTEBOOK/Actividad Notebook 03– Introducción a Python.docx
@@ -100,6 +100,10 @@
         <w:rPr/>
         <w:t>6</w:t>
       </w:r>
+      <w:r>
+        <w:rPr/>
+        <w:t xml:space="preserve">  </w:t>
+      </w:r>
     </w:p>
     <w:p>
       <w:pPr>
@@ -117,29 +121,47 @@
         <w:spacing w:after="160"/>
         <w:ind w:left="0"/>
         <w:rPr>
-          <w:b/>
-          <w:bCs/>
+          <w:b w:val="1"/>
+          <w:bCs w:val="1"/>
           <w:sz w:val="28"/>
-          <w:szCs w:val="20"/>
-        </w:rPr>
-      </w:pPr>
-      <w:r>
-        <w:rPr>
-          <w:b/>
-          <w:bCs/>
+          <w:szCs w:val="28"/>
+        </w:rPr>
+      </w:pPr>
+      <w:r>
+        <w:rPr>
+          <w:b w:val="1"/>
+          <w:bCs w:val="1"/>
           <w:sz w:val="28"/>
-          <w:szCs w:val="20"/>
+          <w:szCs w:val="28"/>
         </w:rPr>
         <w:t xml:space="preserve">Actividad: </w:t>
       </w:r>
       <w:r>
         <w:rPr>
-          <w:b/>
-          <w:bCs/>
+          <w:b w:val="1"/>
+          <w:bCs w:val="1"/>
           <w:sz w:val="28"/>
-          <w:szCs w:val="20"/>
-        </w:rPr>
-        <w:t>NOTEBOOK 01 - Introducción a Python</w:t>
+          <w:szCs w:val="28"/>
+        </w:rPr>
+        <w:t>NOTEBOOK 0</w:t>
+      </w:r>
+      <w:r>
+        <w:rPr>
+          <w:b w:val="1"/>
+          <w:bCs w:val="1"/>
+          <w:sz w:val="28"/>
+          <w:szCs w:val="28"/>
+        </w:rPr>
+        <w:t>7</w:t>
+      </w:r>
+      <w:r>
+        <w:rPr>
+          <w:b w:val="1"/>
+          <w:bCs w:val="1"/>
+          <w:sz w:val="28"/>
+          <w:szCs w:val="28"/>
+        </w:rPr>
+        <w:t xml:space="preserve"> – Procesamiento de listas </w:t>
       </w:r>
     </w:p>
     <w:p>

</xml_diff>

<commit_message>
Cambios en el hub
</commit_message>
<xml_diff>
--- a/NOTEBOOK/Actividad Notebook 03– Introducción a Python.docx
+++ b/NOTEBOOK/Actividad Notebook 03– Introducción a Python.docx
@@ -94,15 +94,7 @@
       </w:r>
       <w:r>
         <w:rPr/>
-        <w:t>0</w:t>
-      </w:r>
-      <w:r>
-        <w:rPr/>
-        <w:t>6</w:t>
-      </w:r>
-      <w:r>
-        <w:rPr/>
-        <w:t xml:space="preserve">  </w:t>
+        <w:t>10</w:t>
       </w:r>
     </w:p>
     <w:p>
@@ -155,64 +147,82 @@
         <w:t>7</w:t>
       </w:r>
       <w:r>
+        <w:tab/>
+      </w:r>
+      <w:r>
         <w:rPr>
           <w:b w:val="1"/>
           <w:bCs w:val="1"/>
           <w:sz w:val="28"/>
           <w:szCs w:val="28"/>
         </w:rPr>
-        <w:t xml:space="preserve"> – Procesamiento de listas </w:t>
-      </w:r>
-    </w:p>
-    <w:p>
-      <w:pPr>
-        <w:spacing w:after="160"/>
-        <w:ind w:left="0"/>
-        <w:rPr>
+        <w:t xml:space="preserve">        </w:t>
+      </w:r>
+      <w:r>
+        <w:rPr>
+          <w:b w:val="1"/>
+          <w:bCs w:val="1"/>
           <w:sz w:val="28"/>
-          <w:szCs w:val="20"/>
-        </w:rPr>
-      </w:pPr>
-      <w:r>
-        <w:rPr>
-          <w:b/>
-          <w:bCs/>
+          <w:szCs w:val="28"/>
+        </w:rPr>
+        <w:t xml:space="preserve">– Procesamiento de listas </w:t>
+      </w:r>
+    </w:p>
+    <w:p>
+      <w:pPr>
+        <w:pStyle w:val="Normal"/>
+        <w:suppressLineNumbers w:val="0"/>
+        <w:bidi w:val="0"/>
+        <w:spacing w:before="0" w:beforeAutospacing="off" w:after="160" w:afterAutospacing="off" w:line="259" w:lineRule="auto"/>
+        <w:ind w:left="0" w:right="0"/>
+        <w:jc w:val="left"/>
+        <w:rPr>
           <w:sz w:val="28"/>
-          <w:szCs w:val="20"/>
+          <w:szCs w:val="28"/>
+        </w:rPr>
+      </w:pPr>
+      <w:r>
+        <w:rPr>
+          <w:b w:val="1"/>
+          <w:bCs w:val="1"/>
+          <w:sz w:val="28"/>
+          <w:szCs w:val="28"/>
         </w:rPr>
         <w:t>Nombre del Estudiante:</w:t>
       </w:r>
       <w:r>
         <w:rPr>
+          <w:b w:val="1"/>
+          <w:bCs w:val="1"/>
           <w:sz w:val="28"/>
-          <w:szCs w:val="20"/>
-        </w:rPr>
-        <w:br/>
-      </w:r>
-      <w:r>
-        <w:rPr>
-          <w:i/>
-          <w:iCs/>
+          <w:szCs w:val="28"/>
+        </w:rPr>
+        <w:t xml:space="preserve">     </w:t>
+      </w:r>
+      <w:r>
+        <w:rPr>
+          <w:i w:val="1"/>
+          <w:iCs w:val="1"/>
           <w:sz w:val="28"/>
-          <w:szCs w:val="20"/>
+          <w:szCs w:val="28"/>
         </w:rPr>
         <w:t>(</w:t>
       </w:r>
       <w:r>
         <w:rPr>
-          <w:i/>
-          <w:iCs/>
+          <w:i w:val="1"/>
+          <w:iCs w:val="1"/>
           <w:sz w:val="28"/>
-          <w:szCs w:val="20"/>
+          <w:szCs w:val="28"/>
         </w:rPr>
         <w:t>David Umaña</w:t>
       </w:r>
       <w:r>
         <w:rPr>
-          <w:i/>
-          <w:iCs/>
+          <w:i w:val="1"/>
+          <w:iCs w:val="1"/>
           <w:sz w:val="28"/>
-          <w:szCs w:val="20"/>
+          <w:szCs w:val="28"/>
         </w:rPr>
         <w:t>)</w:t>
       </w:r>

</xml_diff>